<commit_message>
Database & API Setup for Guests & Guest Data Table - v0.1.0
</commit_message>
<xml_diff>
--- a/database_fields.docx
+++ b/database_fields.docx
@@ -1379,39 +1379,16 @@
           <w:ilvl w:val="1"/>
           <w:numId w:val="1"/>
         </w:numPr>
-      </w:pPr>
-      <w:r>
-        <w:t xml:space="preserve">Acute </w:t>
-      </w:r>
-      <w:proofErr w:type="spellStart"/>
-      <w:r>
-        <w:t>onset</w:t>
-      </w:r>
-      <w:proofErr w:type="spellEnd"/>
-      <w:r>
-        <w:t xml:space="preserve"> </w:t>
-      </w:r>
-      <w:proofErr w:type="spellStart"/>
-      <w:r>
-        <w:t>with</w:t>
-      </w:r>
-      <w:proofErr w:type="spellEnd"/>
-      <w:r>
-        <w:t xml:space="preserve"> </w:t>
-      </w:r>
-      <w:proofErr w:type="spellStart"/>
-      <w:r>
-        <w:t>fluctuating</w:t>
-      </w:r>
-      <w:proofErr w:type="spellEnd"/>
-      <w:r>
-        <w:t xml:space="preserve"> </w:t>
-      </w:r>
-      <w:proofErr w:type="spellStart"/>
-      <w:r>
-        <w:t>course</w:t>
-      </w:r>
-      <w:proofErr w:type="spellEnd"/>
+        <w:rPr>
+          <w:lang w:val="en-US"/>
+        </w:rPr>
+      </w:pPr>
+      <w:r>
+        <w:rPr>
+          <w:lang w:val="en-US"/>
+        </w:rPr>
+        <w:t>Acute onset with fluctuating course</w:t>
+      </w:r>
     </w:p>
     <w:p>
       <w:pPr>
@@ -2492,6 +2469,2047 @@
       <w:proofErr w:type="spellEnd"/>
       <w:r>
         <w:t xml:space="preserve"> IV</w:t>
+      </w:r>
+    </w:p>
+    <w:p/>
+    <w:p/>
+    <w:p>
+      <w:r>
+        <w:t>Con la información de la sección "Evaluación Física" proporcionada, he completado y estructurado los campos adicionales de la colección "</w:t>
+      </w:r>
+      <w:proofErr w:type="spellStart"/>
+      <w:r>
+        <w:t>Guests</w:t>
+      </w:r>
+      <w:proofErr w:type="spellEnd"/>
+      <w:r>
+        <w:t xml:space="preserve">" para el sistema en </w:t>
+      </w:r>
+      <w:proofErr w:type="spellStart"/>
+      <w:r>
+        <w:t>Appwrite</w:t>
+      </w:r>
+      <w:proofErr w:type="spellEnd"/>
+      <w:r>
+        <w:t>. Aquí está la estructura ampliada y detallada:</w:t>
+      </w:r>
+    </w:p>
+    <w:p>
+      <w:pPr>
+        <w:rPr>
+          <w:b/>
+          <w:bCs/>
+        </w:rPr>
+      </w:pPr>
+      <w:r>
+        <w:rPr>
+          <w:b/>
+          <w:bCs/>
+        </w:rPr>
+        <w:t>Campos adicionales para la colección "</w:t>
+      </w:r>
+      <w:proofErr w:type="spellStart"/>
+      <w:r>
+        <w:rPr>
+          <w:b/>
+          <w:bCs/>
+        </w:rPr>
+        <w:t>Guests</w:t>
+      </w:r>
+      <w:proofErr w:type="spellEnd"/>
+      <w:r>
+        <w:rPr>
+          <w:b/>
+          <w:bCs/>
+        </w:rPr>
+        <w:t>"</w:t>
+      </w:r>
+    </w:p>
+    <w:p>
+      <w:pPr>
+        <w:numPr>
+          <w:ilvl w:val="0"/>
+          <w:numId w:val="2"/>
+        </w:numPr>
+      </w:pPr>
+      <w:proofErr w:type="spellStart"/>
+      <w:r>
+        <w:rPr>
+          <w:b/>
+          <w:bCs/>
+        </w:rPr>
+        <w:t>mobility</w:t>
+      </w:r>
+      <w:proofErr w:type="spellEnd"/>
+      <w:r>
+        <w:t xml:space="preserve">: </w:t>
+      </w:r>
+      <w:proofErr w:type="spellStart"/>
+      <w:r>
+        <w:t>Enum</w:t>
+      </w:r>
+      <w:proofErr w:type="spellEnd"/>
+      <w:r>
+        <w:br/>
+      </w:r>
+      <w:r>
+        <w:rPr>
+          <w:i/>
+          <w:iCs/>
+        </w:rPr>
+        <w:t>Estado de deambulación.</w:t>
+      </w:r>
+      <w:r>
+        <w:br/>
+      </w:r>
+      <w:r>
+        <w:rPr>
+          <w:b/>
+          <w:bCs/>
+        </w:rPr>
+        <w:t>Opciones</w:t>
+      </w:r>
+      <w:r>
+        <w:t>:</w:t>
+      </w:r>
+    </w:p>
+    <w:p>
+      <w:pPr>
+        <w:numPr>
+          <w:ilvl w:val="1"/>
+          <w:numId w:val="2"/>
+        </w:numPr>
+      </w:pPr>
+      <w:r>
+        <w:lastRenderedPageBreak/>
+        <w:t>Normal</w:t>
+      </w:r>
+    </w:p>
+    <w:p>
+      <w:pPr>
+        <w:numPr>
+          <w:ilvl w:val="1"/>
+          <w:numId w:val="2"/>
+        </w:numPr>
+      </w:pPr>
+      <w:proofErr w:type="spellStart"/>
+      <w:r>
+        <w:t>With</w:t>
+      </w:r>
+      <w:proofErr w:type="spellEnd"/>
+      <w:r>
+        <w:t xml:space="preserve"> </w:t>
+      </w:r>
+      <w:proofErr w:type="spellStart"/>
+      <w:r>
+        <w:t>Assistance</w:t>
+      </w:r>
+      <w:proofErr w:type="spellEnd"/>
+    </w:p>
+    <w:p>
+      <w:pPr>
+        <w:numPr>
+          <w:ilvl w:val="1"/>
+          <w:numId w:val="2"/>
+        </w:numPr>
+      </w:pPr>
+      <w:proofErr w:type="spellStart"/>
+      <w:r>
+        <w:t>Wheelchair</w:t>
+      </w:r>
+      <w:proofErr w:type="spellEnd"/>
+    </w:p>
+    <w:p>
+      <w:pPr>
+        <w:numPr>
+          <w:ilvl w:val="1"/>
+          <w:numId w:val="2"/>
+        </w:numPr>
+      </w:pPr>
+      <w:r>
+        <w:t>Non-</w:t>
+      </w:r>
+      <w:proofErr w:type="spellStart"/>
+      <w:r>
+        <w:t>ambulatory</w:t>
+      </w:r>
+      <w:proofErr w:type="spellEnd"/>
+    </w:p>
+    <w:p>
+      <w:pPr>
+        <w:numPr>
+          <w:ilvl w:val="0"/>
+          <w:numId w:val="2"/>
+        </w:numPr>
+      </w:pPr>
+      <w:proofErr w:type="spellStart"/>
+      <w:r>
+        <w:rPr>
+          <w:b/>
+          <w:bCs/>
+        </w:rPr>
+        <w:t>mobility_cause</w:t>
+      </w:r>
+      <w:proofErr w:type="spellEnd"/>
+      <w:r>
+        <w:t xml:space="preserve">: </w:t>
+      </w:r>
+      <w:proofErr w:type="spellStart"/>
+      <w:r>
+        <w:t>Enum</w:t>
+      </w:r>
+      <w:proofErr w:type="spellEnd"/>
+      <w:r>
+        <w:br/>
+      </w:r>
+      <w:r>
+        <w:rPr>
+          <w:i/>
+          <w:iCs/>
+        </w:rPr>
+        <w:t>Causa de limitación de la movilidad.</w:t>
+      </w:r>
+      <w:r>
+        <w:br/>
+      </w:r>
+      <w:r>
+        <w:rPr>
+          <w:b/>
+          <w:bCs/>
+        </w:rPr>
+        <w:t>Opciones</w:t>
+      </w:r>
+      <w:r>
+        <w:t>:</w:t>
+      </w:r>
+    </w:p>
+    <w:p>
+      <w:pPr>
+        <w:numPr>
+          <w:ilvl w:val="1"/>
+          <w:numId w:val="2"/>
+        </w:numPr>
+      </w:pPr>
+      <w:proofErr w:type="spellStart"/>
+      <w:r>
+        <w:t>Disease</w:t>
+      </w:r>
+      <w:proofErr w:type="spellEnd"/>
+      <w:r>
+        <w:t xml:space="preserve"> </w:t>
+      </w:r>
+      <w:proofErr w:type="spellStart"/>
+      <w:r>
+        <w:t>Progression</w:t>
+      </w:r>
+      <w:proofErr w:type="spellEnd"/>
+    </w:p>
+    <w:p>
+      <w:pPr>
+        <w:numPr>
+          <w:ilvl w:val="1"/>
+          <w:numId w:val="2"/>
+        </w:numPr>
+      </w:pPr>
+      <w:proofErr w:type="spellStart"/>
+      <w:r>
+        <w:t>Neurological</w:t>
+      </w:r>
+      <w:proofErr w:type="spellEnd"/>
+      <w:r>
+        <w:t xml:space="preserve"> </w:t>
+      </w:r>
+      <w:proofErr w:type="spellStart"/>
+      <w:r>
+        <w:t>Lesion</w:t>
+      </w:r>
+      <w:proofErr w:type="spellEnd"/>
+    </w:p>
+    <w:p>
+      <w:pPr>
+        <w:numPr>
+          <w:ilvl w:val="0"/>
+          <w:numId w:val="2"/>
+        </w:numPr>
+      </w:pPr>
+      <w:proofErr w:type="spellStart"/>
+      <w:r>
+        <w:rPr>
+          <w:b/>
+          <w:bCs/>
+        </w:rPr>
+        <w:t>hygiene</w:t>
+      </w:r>
+      <w:proofErr w:type="spellEnd"/>
+      <w:r>
+        <w:t xml:space="preserve">: </w:t>
+      </w:r>
+      <w:proofErr w:type="spellStart"/>
+      <w:r>
+        <w:t>Enum</w:t>
+      </w:r>
+      <w:proofErr w:type="spellEnd"/>
+      <w:r>
+        <w:br/>
+      </w:r>
+      <w:r>
+        <w:rPr>
+          <w:i/>
+          <w:iCs/>
+        </w:rPr>
+        <w:t>Higiene y arreglo personal.</w:t>
+      </w:r>
+      <w:r>
+        <w:br/>
+      </w:r>
+      <w:r>
+        <w:rPr>
+          <w:b/>
+          <w:bCs/>
+        </w:rPr>
+        <w:t>Opciones</w:t>
+      </w:r>
+      <w:r>
+        <w:t>:</w:t>
+      </w:r>
+    </w:p>
+    <w:p>
+      <w:pPr>
+        <w:numPr>
+          <w:ilvl w:val="1"/>
+          <w:numId w:val="2"/>
+        </w:numPr>
+      </w:pPr>
+      <w:proofErr w:type="spellStart"/>
+      <w:r>
+        <w:t>Independent</w:t>
+      </w:r>
+      <w:proofErr w:type="spellEnd"/>
+    </w:p>
+    <w:p>
+      <w:pPr>
+        <w:numPr>
+          <w:ilvl w:val="1"/>
+          <w:numId w:val="2"/>
+        </w:numPr>
+      </w:pPr>
+      <w:proofErr w:type="spellStart"/>
+      <w:r>
+        <w:t>Bed</w:t>
+      </w:r>
+      <w:proofErr w:type="spellEnd"/>
+      <w:r>
+        <w:t xml:space="preserve"> </w:t>
+      </w:r>
+      <w:proofErr w:type="spellStart"/>
+      <w:r>
+        <w:t>Dependent</w:t>
+      </w:r>
+      <w:proofErr w:type="spellEnd"/>
+    </w:p>
+    <w:p>
+      <w:pPr>
+        <w:numPr>
+          <w:ilvl w:val="1"/>
+          <w:numId w:val="2"/>
+        </w:numPr>
+      </w:pPr>
+      <w:r>
+        <w:t xml:space="preserve">Bath </w:t>
+      </w:r>
+      <w:proofErr w:type="spellStart"/>
+      <w:r>
+        <w:t>Dependent</w:t>
+      </w:r>
+      <w:proofErr w:type="spellEnd"/>
+    </w:p>
+    <w:p>
+      <w:pPr>
+        <w:numPr>
+          <w:ilvl w:val="0"/>
+          <w:numId w:val="2"/>
+        </w:numPr>
+      </w:pPr>
+      <w:proofErr w:type="spellStart"/>
+      <w:r>
+        <w:rPr>
+          <w:b/>
+          <w:bCs/>
+        </w:rPr>
+        <w:t>bath_transfer</w:t>
+      </w:r>
+      <w:proofErr w:type="spellEnd"/>
+      <w:r>
+        <w:t xml:space="preserve">: </w:t>
+      </w:r>
+      <w:proofErr w:type="spellStart"/>
+      <w:r>
+        <w:t>Enum</w:t>
+      </w:r>
+      <w:proofErr w:type="spellEnd"/>
+      <w:r>
+        <w:br/>
+      </w:r>
+      <w:r>
+        <w:rPr>
+          <w:i/>
+          <w:iCs/>
+        </w:rPr>
+        <w:t>Capacidad de trasladarse al baño.</w:t>
+      </w:r>
+      <w:r>
+        <w:br/>
+      </w:r>
+      <w:r>
+        <w:rPr>
+          <w:b/>
+          <w:bCs/>
+        </w:rPr>
+        <w:t>Opciones</w:t>
+      </w:r>
+      <w:r>
+        <w:t>:</w:t>
+      </w:r>
+    </w:p>
+    <w:p>
+      <w:pPr>
+        <w:numPr>
+          <w:ilvl w:val="1"/>
+          <w:numId w:val="2"/>
+        </w:numPr>
+      </w:pPr>
+      <w:r>
+        <w:t>Yes</w:t>
+      </w:r>
+    </w:p>
+    <w:p>
+      <w:pPr>
+        <w:numPr>
+          <w:ilvl w:val="1"/>
+          <w:numId w:val="2"/>
+        </w:numPr>
+      </w:pPr>
+      <w:proofErr w:type="spellStart"/>
+      <w:r>
+        <w:t>With</w:t>
+      </w:r>
+      <w:proofErr w:type="spellEnd"/>
+      <w:r>
+        <w:t xml:space="preserve"> </w:t>
+      </w:r>
+      <w:proofErr w:type="spellStart"/>
+      <w:r>
+        <w:t>Assistance</w:t>
+      </w:r>
+      <w:proofErr w:type="spellEnd"/>
+    </w:p>
+    <w:p>
+      <w:pPr>
+        <w:numPr>
+          <w:ilvl w:val="1"/>
+          <w:numId w:val="2"/>
+        </w:numPr>
+      </w:pPr>
+      <w:r>
+        <w:t>No</w:t>
+      </w:r>
+    </w:p>
+    <w:p>
+      <w:pPr>
+        <w:numPr>
+          <w:ilvl w:val="0"/>
+          <w:numId w:val="2"/>
+        </w:numPr>
+      </w:pPr>
+      <w:r>
+        <w:rPr>
+          <w:b/>
+          <w:bCs/>
+          <w:lang w:val="en-US"/>
+        </w:rPr>
+        <w:t>oral_health</w:t>
+      </w:r>
+      <w:r>
+        <w:rPr>
+          <w:lang w:val="en-US"/>
+        </w:rPr>
+        <w:t>: Enum</w:t>
+      </w:r>
+      <w:r>
+        <w:rPr>
+          <w:lang w:val="en-US"/>
+        </w:rPr>
+        <w:br/>
+      </w:r>
+      <w:r>
+        <w:rPr>
+          <w:i/>
+          <w:iCs/>
+          <w:lang w:val="en-US"/>
+        </w:rPr>
+        <w:t>Estado bucal.</w:t>
+      </w:r>
+      <w:r>
+        <w:rPr>
+          <w:lang w:val="en-US"/>
+        </w:rPr>
+        <w:br/>
+      </w:r>
+      <w:r>
+        <w:rPr>
+          <w:b/>
+          <w:bCs/>
+        </w:rPr>
+        <w:t>Opciones</w:t>
+      </w:r>
+      <w:r>
+        <w:t>:</w:t>
+      </w:r>
+    </w:p>
+    <w:p>
+      <w:pPr>
+        <w:numPr>
+          <w:ilvl w:val="1"/>
+          <w:numId w:val="2"/>
+        </w:numPr>
+      </w:pPr>
+      <w:proofErr w:type="spellStart"/>
+      <w:r>
+        <w:t>Healthy</w:t>
+      </w:r>
+      <w:proofErr w:type="spellEnd"/>
+    </w:p>
+    <w:p>
+      <w:pPr>
+        <w:numPr>
+          <w:ilvl w:val="1"/>
+          <w:numId w:val="2"/>
+        </w:numPr>
+      </w:pPr>
+      <w:proofErr w:type="spellStart"/>
+      <w:r>
+        <w:t>Dry</w:t>
+      </w:r>
+      <w:proofErr w:type="spellEnd"/>
+    </w:p>
+    <w:p>
+      <w:pPr>
+        <w:numPr>
+          <w:ilvl w:val="1"/>
+          <w:numId w:val="2"/>
+        </w:numPr>
+      </w:pPr>
+      <w:proofErr w:type="spellStart"/>
+      <w:r>
+        <w:t>Painful</w:t>
+      </w:r>
+      <w:proofErr w:type="spellEnd"/>
+    </w:p>
+    <w:p>
+      <w:pPr>
+        <w:numPr>
+          <w:ilvl w:val="1"/>
+          <w:numId w:val="2"/>
+        </w:numPr>
+      </w:pPr>
+      <w:proofErr w:type="spellStart"/>
+      <w:r>
+        <w:t>Bleeding</w:t>
+      </w:r>
+      <w:proofErr w:type="spellEnd"/>
+    </w:p>
+    <w:p>
+      <w:pPr>
+        <w:numPr>
+          <w:ilvl w:val="1"/>
+          <w:numId w:val="2"/>
+        </w:numPr>
+      </w:pPr>
+      <w:r>
+        <w:t>Mucositis</w:t>
+      </w:r>
+    </w:p>
+    <w:p>
+      <w:pPr>
+        <w:numPr>
+          <w:ilvl w:val="1"/>
+          <w:numId w:val="2"/>
+        </w:numPr>
+      </w:pPr>
+      <w:proofErr w:type="spellStart"/>
+      <w:r>
+        <w:t>Mycosis</w:t>
+      </w:r>
+      <w:proofErr w:type="spellEnd"/>
+    </w:p>
+    <w:p>
+      <w:pPr>
+        <w:numPr>
+          <w:ilvl w:val="1"/>
+          <w:numId w:val="2"/>
+        </w:numPr>
+      </w:pPr>
+      <w:proofErr w:type="spellStart"/>
+      <w:r>
+        <w:t>Prosthesis</w:t>
+      </w:r>
+      <w:proofErr w:type="spellEnd"/>
+    </w:p>
+    <w:p>
+      <w:pPr>
+        <w:numPr>
+          <w:ilvl w:val="0"/>
+          <w:numId w:val="2"/>
+        </w:numPr>
+      </w:pPr>
+      <w:proofErr w:type="spellStart"/>
+      <w:r>
+        <w:rPr>
+          <w:b/>
+          <w:bCs/>
+        </w:rPr>
+        <w:lastRenderedPageBreak/>
+        <w:t>swallowing</w:t>
+      </w:r>
+      <w:proofErr w:type="spellEnd"/>
+      <w:r>
+        <w:t xml:space="preserve">: </w:t>
+      </w:r>
+      <w:proofErr w:type="spellStart"/>
+      <w:r>
+        <w:t>Enum</w:t>
+      </w:r>
+      <w:proofErr w:type="spellEnd"/>
+      <w:r>
+        <w:br/>
+      </w:r>
+      <w:r>
+        <w:rPr>
+          <w:i/>
+          <w:iCs/>
+        </w:rPr>
+        <w:t>Estado de deglución.</w:t>
+      </w:r>
+      <w:r>
+        <w:br/>
+      </w:r>
+      <w:r>
+        <w:rPr>
+          <w:b/>
+          <w:bCs/>
+        </w:rPr>
+        <w:t>Opciones</w:t>
+      </w:r>
+      <w:r>
+        <w:t>:</w:t>
+      </w:r>
+    </w:p>
+    <w:p>
+      <w:pPr>
+        <w:numPr>
+          <w:ilvl w:val="1"/>
+          <w:numId w:val="2"/>
+        </w:numPr>
+      </w:pPr>
+      <w:r>
+        <w:t>Normal</w:t>
+      </w:r>
+    </w:p>
+    <w:p>
+      <w:pPr>
+        <w:numPr>
+          <w:ilvl w:val="1"/>
+          <w:numId w:val="2"/>
+        </w:numPr>
+      </w:pPr>
+      <w:proofErr w:type="spellStart"/>
+      <w:r>
+        <w:t>Mild</w:t>
+      </w:r>
+      <w:proofErr w:type="spellEnd"/>
+      <w:r>
+        <w:t xml:space="preserve"> </w:t>
+      </w:r>
+      <w:proofErr w:type="spellStart"/>
+      <w:r>
+        <w:t>Disorder</w:t>
+      </w:r>
+      <w:proofErr w:type="spellEnd"/>
+    </w:p>
+    <w:p>
+      <w:pPr>
+        <w:numPr>
+          <w:ilvl w:val="1"/>
+          <w:numId w:val="2"/>
+        </w:numPr>
+      </w:pPr>
+      <w:proofErr w:type="spellStart"/>
+      <w:r>
+        <w:t>Moderate</w:t>
+      </w:r>
+      <w:proofErr w:type="spellEnd"/>
+      <w:r>
+        <w:t xml:space="preserve"> </w:t>
+      </w:r>
+      <w:proofErr w:type="spellStart"/>
+      <w:r>
+        <w:t>Disorder</w:t>
+      </w:r>
+      <w:proofErr w:type="spellEnd"/>
+    </w:p>
+    <w:p>
+      <w:pPr>
+        <w:numPr>
+          <w:ilvl w:val="1"/>
+          <w:numId w:val="2"/>
+        </w:numPr>
+      </w:pPr>
+      <w:r>
+        <w:t xml:space="preserve">Severe </w:t>
+      </w:r>
+      <w:proofErr w:type="spellStart"/>
+      <w:r>
+        <w:t>Disorder</w:t>
+      </w:r>
+      <w:proofErr w:type="spellEnd"/>
+    </w:p>
+    <w:p>
+      <w:pPr>
+        <w:numPr>
+          <w:ilvl w:val="0"/>
+          <w:numId w:val="2"/>
+        </w:numPr>
+      </w:pPr>
+      <w:proofErr w:type="spellStart"/>
+      <w:r>
+        <w:rPr>
+          <w:b/>
+          <w:bCs/>
+        </w:rPr>
+        <w:t>nutrition</w:t>
+      </w:r>
+      <w:proofErr w:type="spellEnd"/>
+      <w:r>
+        <w:t xml:space="preserve">: </w:t>
+      </w:r>
+      <w:proofErr w:type="spellStart"/>
+      <w:r>
+        <w:t>Enum</w:t>
+      </w:r>
+      <w:proofErr w:type="spellEnd"/>
+      <w:r>
+        <w:br/>
+      </w:r>
+      <w:r>
+        <w:rPr>
+          <w:i/>
+          <w:iCs/>
+        </w:rPr>
+        <w:t>Estado de nutrición.</w:t>
+      </w:r>
+      <w:r>
+        <w:br/>
+      </w:r>
+      <w:r>
+        <w:rPr>
+          <w:b/>
+          <w:bCs/>
+        </w:rPr>
+        <w:t>Opciones</w:t>
+      </w:r>
+      <w:r>
+        <w:t>:</w:t>
+      </w:r>
+    </w:p>
+    <w:p>
+      <w:pPr>
+        <w:numPr>
+          <w:ilvl w:val="1"/>
+          <w:numId w:val="2"/>
+        </w:numPr>
+      </w:pPr>
+      <w:proofErr w:type="spellStart"/>
+      <w:r>
+        <w:t>Eats</w:t>
+      </w:r>
+      <w:proofErr w:type="spellEnd"/>
+      <w:r>
+        <w:t xml:space="preserve"> Alone</w:t>
+      </w:r>
+    </w:p>
+    <w:p>
+      <w:pPr>
+        <w:numPr>
+          <w:ilvl w:val="1"/>
+          <w:numId w:val="2"/>
+        </w:numPr>
+      </w:pPr>
+      <w:proofErr w:type="spellStart"/>
+      <w:r>
+        <w:t>With</w:t>
+      </w:r>
+      <w:proofErr w:type="spellEnd"/>
+      <w:r>
+        <w:t xml:space="preserve"> </w:t>
+      </w:r>
+      <w:proofErr w:type="spellStart"/>
+      <w:r>
+        <w:t>Assistance</w:t>
+      </w:r>
+      <w:proofErr w:type="spellEnd"/>
+    </w:p>
+    <w:p>
+      <w:pPr>
+        <w:numPr>
+          <w:ilvl w:val="1"/>
+          <w:numId w:val="2"/>
+        </w:numPr>
+      </w:pPr>
+      <w:r>
+        <w:t xml:space="preserve">No Oral </w:t>
+      </w:r>
+      <w:proofErr w:type="spellStart"/>
+      <w:r>
+        <w:t>Intake</w:t>
+      </w:r>
+      <w:proofErr w:type="spellEnd"/>
+    </w:p>
+    <w:p>
+      <w:pPr>
+        <w:numPr>
+          <w:ilvl w:val="1"/>
+          <w:numId w:val="2"/>
+        </w:numPr>
+      </w:pPr>
+      <w:proofErr w:type="spellStart"/>
+      <w:r>
+        <w:t>Nasogastric</w:t>
+      </w:r>
+      <w:proofErr w:type="spellEnd"/>
+      <w:r>
+        <w:t xml:space="preserve"> </w:t>
+      </w:r>
+      <w:proofErr w:type="spellStart"/>
+      <w:r>
+        <w:t>Tube</w:t>
+      </w:r>
+      <w:proofErr w:type="spellEnd"/>
+      <w:r>
+        <w:t xml:space="preserve"> (SNG)</w:t>
+      </w:r>
+    </w:p>
+    <w:p>
+      <w:pPr>
+        <w:numPr>
+          <w:ilvl w:val="0"/>
+          <w:numId w:val="2"/>
+        </w:numPr>
+      </w:pPr>
+      <w:proofErr w:type="spellStart"/>
+      <w:r>
+        <w:rPr>
+          <w:b/>
+          <w:bCs/>
+        </w:rPr>
+        <w:t>hydration</w:t>
+      </w:r>
+      <w:proofErr w:type="spellEnd"/>
+      <w:r>
+        <w:t xml:space="preserve">: </w:t>
+      </w:r>
+      <w:proofErr w:type="spellStart"/>
+      <w:r>
+        <w:t>Enum</w:t>
+      </w:r>
+      <w:proofErr w:type="spellEnd"/>
+      <w:r>
+        <w:br/>
+      </w:r>
+      <w:r>
+        <w:rPr>
+          <w:i/>
+          <w:iCs/>
+        </w:rPr>
+        <w:t>Estado de hidratación.</w:t>
+      </w:r>
+      <w:r>
+        <w:br/>
+      </w:r>
+      <w:r>
+        <w:rPr>
+          <w:b/>
+          <w:bCs/>
+        </w:rPr>
+        <w:t>Opciones</w:t>
+      </w:r>
+      <w:r>
+        <w:t>:</w:t>
+      </w:r>
+    </w:p>
+    <w:p>
+      <w:pPr>
+        <w:numPr>
+          <w:ilvl w:val="1"/>
+          <w:numId w:val="2"/>
+        </w:numPr>
+      </w:pPr>
+      <w:r>
+        <w:t>Normal</w:t>
+      </w:r>
+    </w:p>
+    <w:p>
+      <w:pPr>
+        <w:numPr>
+          <w:ilvl w:val="1"/>
+          <w:numId w:val="2"/>
+        </w:numPr>
+      </w:pPr>
+      <w:proofErr w:type="spellStart"/>
+      <w:r>
+        <w:t>Dehydrated</w:t>
+      </w:r>
+      <w:proofErr w:type="spellEnd"/>
+    </w:p>
+    <w:p>
+      <w:pPr>
+        <w:numPr>
+          <w:ilvl w:val="0"/>
+          <w:numId w:val="2"/>
+        </w:numPr>
+      </w:pPr>
+      <w:proofErr w:type="spellStart"/>
+      <w:r>
+        <w:rPr>
+          <w:b/>
+          <w:bCs/>
+        </w:rPr>
+        <w:t>hydration_method</w:t>
+      </w:r>
+      <w:proofErr w:type="spellEnd"/>
+      <w:r>
+        <w:t xml:space="preserve">: </w:t>
+      </w:r>
+      <w:proofErr w:type="spellStart"/>
+      <w:r>
+        <w:t>Enum</w:t>
+      </w:r>
+      <w:proofErr w:type="spellEnd"/>
+      <w:r>
+        <w:br/>
+      </w:r>
+      <w:r>
+        <w:rPr>
+          <w:i/>
+          <w:iCs/>
+        </w:rPr>
+        <w:t>Método de hidratación.</w:t>
+      </w:r>
+      <w:r>
+        <w:br/>
+      </w:r>
+      <w:r>
+        <w:rPr>
+          <w:b/>
+          <w:bCs/>
+        </w:rPr>
+        <w:t>Opciones</w:t>
+      </w:r>
+      <w:r>
+        <w:t>:</w:t>
+      </w:r>
+    </w:p>
+    <w:p>
+      <w:pPr>
+        <w:numPr>
+          <w:ilvl w:val="1"/>
+          <w:numId w:val="2"/>
+        </w:numPr>
+      </w:pPr>
+      <w:r>
+        <w:t>Oral</w:t>
+      </w:r>
+    </w:p>
+    <w:p>
+      <w:pPr>
+        <w:numPr>
+          <w:ilvl w:val="1"/>
+          <w:numId w:val="2"/>
+        </w:numPr>
+      </w:pPr>
+      <w:proofErr w:type="spellStart"/>
+      <w:r>
+        <w:t>Subcutaneous</w:t>
+      </w:r>
+      <w:proofErr w:type="spellEnd"/>
+      <w:r>
+        <w:t xml:space="preserve"> (SC)</w:t>
+      </w:r>
+    </w:p>
+    <w:p>
+      <w:pPr>
+        <w:numPr>
+          <w:ilvl w:val="1"/>
+          <w:numId w:val="2"/>
+        </w:numPr>
+      </w:pPr>
+      <w:proofErr w:type="spellStart"/>
+      <w:r>
+        <w:t>Intravenous</w:t>
+      </w:r>
+      <w:proofErr w:type="spellEnd"/>
+      <w:r>
+        <w:t xml:space="preserve"> (IV)</w:t>
+      </w:r>
+    </w:p>
+    <w:p>
+      <w:pPr>
+        <w:numPr>
+          <w:ilvl w:val="0"/>
+          <w:numId w:val="2"/>
+        </w:numPr>
+      </w:pPr>
+      <w:proofErr w:type="spellStart"/>
+      <w:r>
+        <w:rPr>
+          <w:b/>
+          <w:bCs/>
+        </w:rPr>
+        <w:t>abdominal_</w:t>
+      </w:r>
+      <w:proofErr w:type="gramStart"/>
+      <w:r>
+        <w:rPr>
+          <w:b/>
+          <w:bCs/>
+        </w:rPr>
+        <w:t>status</w:t>
+      </w:r>
+      <w:proofErr w:type="spellEnd"/>
+      <w:proofErr w:type="gramEnd"/>
+      <w:r>
+        <w:t xml:space="preserve">: </w:t>
+      </w:r>
+      <w:proofErr w:type="spellStart"/>
+      <w:r>
+        <w:t>Enum</w:t>
+      </w:r>
+      <w:proofErr w:type="spellEnd"/>
+      <w:r>
+        <w:br/>
+      </w:r>
+      <w:r>
+        <w:rPr>
+          <w:i/>
+          <w:iCs/>
+        </w:rPr>
+        <w:t>Estado abdominal.</w:t>
+      </w:r>
+      <w:r>
+        <w:br/>
+      </w:r>
+      <w:r>
+        <w:rPr>
+          <w:b/>
+          <w:bCs/>
+        </w:rPr>
+        <w:t>Opciones</w:t>
+      </w:r>
+      <w:r>
+        <w:t>:</w:t>
+      </w:r>
+    </w:p>
+    <w:p>
+      <w:pPr>
+        <w:numPr>
+          <w:ilvl w:val="1"/>
+          <w:numId w:val="2"/>
+        </w:numPr>
+      </w:pPr>
+      <w:r>
+        <w:t>Normal</w:t>
+      </w:r>
+    </w:p>
+    <w:p>
+      <w:pPr>
+        <w:numPr>
+          <w:ilvl w:val="1"/>
+          <w:numId w:val="2"/>
+        </w:numPr>
+      </w:pPr>
+      <w:r>
+        <w:t>Distended</w:t>
+      </w:r>
+    </w:p>
+    <w:p>
+      <w:pPr>
+        <w:numPr>
+          <w:ilvl w:val="1"/>
+          <w:numId w:val="2"/>
+        </w:numPr>
+      </w:pPr>
+      <w:proofErr w:type="spellStart"/>
+      <w:r>
+        <w:t>Painful</w:t>
+      </w:r>
+      <w:proofErr w:type="spellEnd"/>
+    </w:p>
+    <w:p>
+      <w:pPr>
+        <w:numPr>
+          <w:ilvl w:val="0"/>
+          <w:numId w:val="2"/>
+        </w:numPr>
+      </w:pPr>
+      <w:proofErr w:type="spellStart"/>
+      <w:r>
+        <w:rPr>
+          <w:b/>
+          <w:bCs/>
+        </w:rPr>
+        <w:lastRenderedPageBreak/>
+        <w:t>urinary_function</w:t>
+      </w:r>
+      <w:proofErr w:type="spellEnd"/>
+      <w:r>
+        <w:t xml:space="preserve">: </w:t>
+      </w:r>
+      <w:proofErr w:type="spellStart"/>
+      <w:r>
+        <w:t>Enum</w:t>
+      </w:r>
+      <w:proofErr w:type="spellEnd"/>
+      <w:r>
+        <w:br/>
+      </w:r>
+      <w:r>
+        <w:rPr>
+          <w:i/>
+          <w:iCs/>
+        </w:rPr>
+        <w:t>Estado de la diuresis.</w:t>
+      </w:r>
+      <w:r>
+        <w:br/>
+      </w:r>
+      <w:r>
+        <w:rPr>
+          <w:b/>
+          <w:bCs/>
+        </w:rPr>
+        <w:t>Opciones</w:t>
+      </w:r>
+      <w:r>
+        <w:t>:</w:t>
+      </w:r>
+    </w:p>
+    <w:p>
+      <w:pPr>
+        <w:numPr>
+          <w:ilvl w:val="1"/>
+          <w:numId w:val="2"/>
+        </w:numPr>
+      </w:pPr>
+      <w:r>
+        <w:t>Normal</w:t>
+      </w:r>
+    </w:p>
+    <w:p>
+      <w:pPr>
+        <w:numPr>
+          <w:ilvl w:val="1"/>
+          <w:numId w:val="2"/>
+        </w:numPr>
+      </w:pPr>
+      <w:proofErr w:type="spellStart"/>
+      <w:r>
+        <w:t>Diaper</w:t>
+      </w:r>
+      <w:proofErr w:type="spellEnd"/>
+    </w:p>
+    <w:p>
+      <w:pPr>
+        <w:numPr>
+          <w:ilvl w:val="1"/>
+          <w:numId w:val="2"/>
+        </w:numPr>
+      </w:pPr>
+      <w:proofErr w:type="spellStart"/>
+      <w:r>
+        <w:t>Incontinence</w:t>
+      </w:r>
+      <w:proofErr w:type="spellEnd"/>
+    </w:p>
+    <w:p>
+      <w:pPr>
+        <w:numPr>
+          <w:ilvl w:val="1"/>
+          <w:numId w:val="2"/>
+        </w:numPr>
+      </w:pPr>
+      <w:proofErr w:type="spellStart"/>
+      <w:r>
+        <w:t>Urinary</w:t>
+      </w:r>
+      <w:proofErr w:type="spellEnd"/>
+      <w:r>
+        <w:t xml:space="preserve"> </w:t>
+      </w:r>
+      <w:proofErr w:type="spellStart"/>
+      <w:r>
+        <w:t>Catheter</w:t>
+      </w:r>
+      <w:proofErr w:type="spellEnd"/>
+    </w:p>
+    <w:p>
+      <w:pPr>
+        <w:numPr>
+          <w:ilvl w:val="0"/>
+          <w:numId w:val="2"/>
+        </w:numPr>
+      </w:pPr>
+      <w:proofErr w:type="spellStart"/>
+      <w:r>
+        <w:rPr>
+          <w:b/>
+          <w:bCs/>
+        </w:rPr>
+        <w:t>urine_characteristics</w:t>
+      </w:r>
+      <w:proofErr w:type="spellEnd"/>
+      <w:r>
+        <w:t xml:space="preserve">: </w:t>
+      </w:r>
+      <w:proofErr w:type="spellStart"/>
+      <w:r>
+        <w:t>Enum</w:t>
+      </w:r>
+      <w:proofErr w:type="spellEnd"/>
+      <w:r>
+        <w:br/>
+      </w:r>
+      <w:r>
+        <w:rPr>
+          <w:i/>
+          <w:iCs/>
+        </w:rPr>
+        <w:t>Características de la orina.</w:t>
+      </w:r>
+      <w:r>
+        <w:br/>
+      </w:r>
+      <w:r>
+        <w:rPr>
+          <w:b/>
+          <w:bCs/>
+        </w:rPr>
+        <w:t>Opciones</w:t>
+      </w:r>
+      <w:r>
+        <w:t>:</w:t>
+      </w:r>
+    </w:p>
+    <w:p>
+      <w:pPr>
+        <w:numPr>
+          <w:ilvl w:val="1"/>
+          <w:numId w:val="2"/>
+        </w:numPr>
+      </w:pPr>
+      <w:proofErr w:type="spellStart"/>
+      <w:r>
+        <w:t>Hematuric</w:t>
+      </w:r>
+      <w:proofErr w:type="spellEnd"/>
+    </w:p>
+    <w:p>
+      <w:pPr>
+        <w:numPr>
+          <w:ilvl w:val="1"/>
+          <w:numId w:val="2"/>
+        </w:numPr>
+      </w:pPr>
+      <w:proofErr w:type="spellStart"/>
+      <w:r>
+        <w:t>Coluric</w:t>
+      </w:r>
+      <w:proofErr w:type="spellEnd"/>
+    </w:p>
+    <w:p>
+      <w:pPr>
+        <w:numPr>
+          <w:ilvl w:val="1"/>
+          <w:numId w:val="2"/>
+        </w:numPr>
+      </w:pPr>
+      <w:proofErr w:type="spellStart"/>
+      <w:r>
+        <w:t>With</w:t>
+      </w:r>
+      <w:proofErr w:type="spellEnd"/>
+      <w:r>
+        <w:t xml:space="preserve"> </w:t>
+      </w:r>
+      <w:proofErr w:type="spellStart"/>
+      <w:r>
+        <w:t>Sediment</w:t>
+      </w:r>
+      <w:proofErr w:type="spellEnd"/>
+    </w:p>
+    <w:p>
+      <w:pPr>
+        <w:numPr>
+          <w:ilvl w:val="0"/>
+          <w:numId w:val="2"/>
+        </w:numPr>
+      </w:pPr>
+      <w:proofErr w:type="spellStart"/>
+      <w:r>
+        <w:rPr>
+          <w:b/>
+          <w:bCs/>
+        </w:rPr>
+        <w:t>bowel_function</w:t>
+      </w:r>
+      <w:proofErr w:type="spellEnd"/>
+      <w:r>
+        <w:t xml:space="preserve">: </w:t>
+      </w:r>
+      <w:proofErr w:type="spellStart"/>
+      <w:r>
+        <w:t>Enum</w:t>
+      </w:r>
+      <w:proofErr w:type="spellEnd"/>
+      <w:r>
+        <w:br/>
+      </w:r>
+      <w:r>
+        <w:rPr>
+          <w:i/>
+          <w:iCs/>
+        </w:rPr>
+        <w:t>Estado de la catarsis.</w:t>
+      </w:r>
+      <w:r>
+        <w:br/>
+      </w:r>
+      <w:r>
+        <w:rPr>
+          <w:b/>
+          <w:bCs/>
+        </w:rPr>
+        <w:t>Opciones</w:t>
+      </w:r>
+      <w:r>
+        <w:t>:</w:t>
+      </w:r>
+    </w:p>
+    <w:p>
+      <w:pPr>
+        <w:numPr>
+          <w:ilvl w:val="1"/>
+          <w:numId w:val="2"/>
+        </w:numPr>
+      </w:pPr>
+      <w:r>
+        <w:t>Normal</w:t>
+      </w:r>
+    </w:p>
+    <w:p>
+      <w:pPr>
+        <w:numPr>
+          <w:ilvl w:val="1"/>
+          <w:numId w:val="2"/>
+        </w:numPr>
+      </w:pPr>
+      <w:proofErr w:type="spellStart"/>
+      <w:r>
+        <w:t>Diaper</w:t>
+      </w:r>
+      <w:proofErr w:type="spellEnd"/>
+    </w:p>
+    <w:p>
+      <w:pPr>
+        <w:numPr>
+          <w:ilvl w:val="1"/>
+          <w:numId w:val="2"/>
+        </w:numPr>
+      </w:pPr>
+      <w:proofErr w:type="spellStart"/>
+      <w:r>
+        <w:t>Incontinence</w:t>
+      </w:r>
+      <w:proofErr w:type="spellEnd"/>
+    </w:p>
+    <w:p>
+      <w:pPr>
+        <w:numPr>
+          <w:ilvl w:val="1"/>
+          <w:numId w:val="2"/>
+        </w:numPr>
+      </w:pPr>
+      <w:proofErr w:type="spellStart"/>
+      <w:r>
+        <w:t>Constipation</w:t>
+      </w:r>
+      <w:proofErr w:type="spellEnd"/>
+    </w:p>
+    <w:p>
+      <w:pPr>
+        <w:numPr>
+          <w:ilvl w:val="1"/>
+          <w:numId w:val="2"/>
+        </w:numPr>
+      </w:pPr>
+      <w:proofErr w:type="spellStart"/>
+      <w:r>
+        <w:t>Diarrhea</w:t>
+      </w:r>
+      <w:proofErr w:type="spellEnd"/>
+    </w:p>
+    <w:p>
+      <w:pPr>
+        <w:numPr>
+          <w:ilvl w:val="0"/>
+          <w:numId w:val="2"/>
+        </w:numPr>
+      </w:pPr>
+      <w:proofErr w:type="spellStart"/>
+      <w:r>
+        <w:rPr>
+          <w:b/>
+          <w:bCs/>
+        </w:rPr>
+        <w:t>stool_consistency</w:t>
+      </w:r>
+      <w:proofErr w:type="spellEnd"/>
+      <w:r>
+        <w:t xml:space="preserve">: </w:t>
+      </w:r>
+      <w:proofErr w:type="spellStart"/>
+      <w:r>
+        <w:t>Enum</w:t>
+      </w:r>
+      <w:proofErr w:type="spellEnd"/>
+      <w:r>
+        <w:br/>
+      </w:r>
+      <w:r>
+        <w:rPr>
+          <w:i/>
+          <w:iCs/>
+        </w:rPr>
+        <w:t>Consistencia de la catarsis.</w:t>
+      </w:r>
+      <w:r>
+        <w:br/>
+      </w:r>
+      <w:r>
+        <w:rPr>
+          <w:b/>
+          <w:bCs/>
+        </w:rPr>
+        <w:t>Opciones</w:t>
+      </w:r>
+      <w:r>
+        <w:t>:</w:t>
+      </w:r>
+    </w:p>
+    <w:p>
+      <w:pPr>
+        <w:numPr>
+          <w:ilvl w:val="1"/>
+          <w:numId w:val="2"/>
+        </w:numPr>
+      </w:pPr>
+      <w:r>
+        <w:t>Normal</w:t>
+      </w:r>
+    </w:p>
+    <w:p>
+      <w:pPr>
+        <w:numPr>
+          <w:ilvl w:val="1"/>
+          <w:numId w:val="2"/>
+        </w:numPr>
+      </w:pPr>
+      <w:proofErr w:type="spellStart"/>
+      <w:r>
+        <w:t>Hard</w:t>
+      </w:r>
+      <w:proofErr w:type="spellEnd"/>
+    </w:p>
+    <w:p>
+      <w:pPr>
+        <w:numPr>
+          <w:ilvl w:val="1"/>
+          <w:numId w:val="2"/>
+        </w:numPr>
+      </w:pPr>
+      <w:proofErr w:type="spellStart"/>
+      <w:r>
+        <w:t>With</w:t>
+      </w:r>
+      <w:proofErr w:type="spellEnd"/>
+      <w:r>
+        <w:t xml:space="preserve"> </w:t>
+      </w:r>
+      <w:proofErr w:type="spellStart"/>
+      <w:r>
+        <w:t>Blood</w:t>
+      </w:r>
+      <w:proofErr w:type="spellEnd"/>
+    </w:p>
+    <w:p>
+      <w:pPr>
+        <w:numPr>
+          <w:ilvl w:val="0"/>
+          <w:numId w:val="2"/>
+        </w:numPr>
+      </w:pPr>
+      <w:proofErr w:type="spellStart"/>
+      <w:r>
+        <w:rPr>
+          <w:b/>
+          <w:bCs/>
+        </w:rPr>
+        <w:t>respiratory_system</w:t>
+      </w:r>
+      <w:proofErr w:type="spellEnd"/>
+      <w:r>
+        <w:t xml:space="preserve">: </w:t>
+      </w:r>
+      <w:proofErr w:type="spellStart"/>
+      <w:r>
+        <w:t>Enum</w:t>
+      </w:r>
+      <w:proofErr w:type="spellEnd"/>
+      <w:r>
+        <w:br/>
+      </w:r>
+      <w:r>
+        <w:rPr>
+          <w:i/>
+          <w:iCs/>
+        </w:rPr>
+        <w:t>Estado del aparato respiratorio.</w:t>
+      </w:r>
+      <w:r>
+        <w:br/>
+      </w:r>
+      <w:r>
+        <w:rPr>
+          <w:b/>
+          <w:bCs/>
+        </w:rPr>
+        <w:t>Opciones</w:t>
+      </w:r>
+      <w:r>
+        <w:t>:</w:t>
+      </w:r>
+    </w:p>
+    <w:p>
+      <w:pPr>
+        <w:numPr>
+          <w:ilvl w:val="1"/>
+          <w:numId w:val="2"/>
+        </w:numPr>
+      </w:pPr>
+      <w:r>
+        <w:t>Normal</w:t>
+      </w:r>
+    </w:p>
+    <w:p>
+      <w:pPr>
+        <w:numPr>
+          <w:ilvl w:val="1"/>
+          <w:numId w:val="2"/>
+        </w:numPr>
+      </w:pPr>
+      <w:proofErr w:type="spellStart"/>
+      <w:r>
+        <w:lastRenderedPageBreak/>
+        <w:t>Respiratory</w:t>
+      </w:r>
+      <w:proofErr w:type="spellEnd"/>
+      <w:r>
+        <w:t xml:space="preserve"> </w:t>
+      </w:r>
+      <w:proofErr w:type="spellStart"/>
+      <w:r>
+        <w:t>Difficulty</w:t>
+      </w:r>
+      <w:proofErr w:type="spellEnd"/>
+    </w:p>
+    <w:p>
+      <w:pPr>
+        <w:numPr>
+          <w:ilvl w:val="1"/>
+          <w:numId w:val="2"/>
+        </w:numPr>
+      </w:pPr>
+      <w:proofErr w:type="spellStart"/>
+      <w:r>
+        <w:t>Dyspnea</w:t>
+      </w:r>
+      <w:proofErr w:type="spellEnd"/>
+    </w:p>
+    <w:p>
+      <w:pPr>
+        <w:numPr>
+          <w:ilvl w:val="1"/>
+          <w:numId w:val="2"/>
+        </w:numPr>
+      </w:pPr>
+      <w:proofErr w:type="spellStart"/>
+      <w:r>
+        <w:t>Cough</w:t>
+      </w:r>
+      <w:proofErr w:type="spellEnd"/>
+    </w:p>
+    <w:p>
+      <w:pPr>
+        <w:numPr>
+          <w:ilvl w:val="0"/>
+          <w:numId w:val="2"/>
+        </w:numPr>
+      </w:pPr>
+      <w:proofErr w:type="spellStart"/>
+      <w:r>
+        <w:rPr>
+          <w:b/>
+          <w:bCs/>
+        </w:rPr>
+        <w:t>sputum_type</w:t>
+      </w:r>
+      <w:proofErr w:type="spellEnd"/>
+      <w:r>
+        <w:t xml:space="preserve">: </w:t>
+      </w:r>
+      <w:proofErr w:type="spellStart"/>
+      <w:r>
+        <w:t>String</w:t>
+      </w:r>
+      <w:proofErr w:type="spellEnd"/>
+      <w:r>
+        <w:br/>
+      </w:r>
+      <w:r>
+        <w:rPr>
+          <w:i/>
+          <w:iCs/>
+        </w:rPr>
+        <w:t>Tipo de esputo, especificar.</w:t>
+      </w:r>
+    </w:p>
+    <w:p>
+      <w:pPr>
+        <w:numPr>
+          <w:ilvl w:val="0"/>
+          <w:numId w:val="2"/>
+        </w:numPr>
+      </w:pPr>
+      <w:proofErr w:type="spellStart"/>
+      <w:r>
+        <w:rPr>
+          <w:b/>
+          <w:bCs/>
+        </w:rPr>
+        <w:t>pressure_ulcers</w:t>
+      </w:r>
+      <w:proofErr w:type="spellEnd"/>
+      <w:r>
+        <w:t xml:space="preserve">: </w:t>
+      </w:r>
+      <w:proofErr w:type="spellStart"/>
+      <w:r>
+        <w:t>Enum</w:t>
+      </w:r>
+      <w:proofErr w:type="spellEnd"/>
+      <w:r>
+        <w:br/>
+      </w:r>
+      <w:r>
+        <w:rPr>
+          <w:i/>
+          <w:iCs/>
+        </w:rPr>
+        <w:t>Presencia y estadio de úlceras por presión.</w:t>
+      </w:r>
+      <w:r>
+        <w:br/>
+      </w:r>
+      <w:r>
+        <w:rPr>
+          <w:b/>
+          <w:bCs/>
+        </w:rPr>
+        <w:t>Opciones</w:t>
+      </w:r>
+      <w:r>
+        <w:t>:</w:t>
+      </w:r>
+    </w:p>
+    <w:p>
+      <w:pPr>
+        <w:numPr>
+          <w:ilvl w:val="1"/>
+          <w:numId w:val="2"/>
+        </w:numPr>
+      </w:pPr>
+      <w:proofErr w:type="spellStart"/>
+      <w:r>
+        <w:t>None</w:t>
+      </w:r>
+      <w:proofErr w:type="spellEnd"/>
+    </w:p>
+    <w:p>
+      <w:pPr>
+        <w:numPr>
+          <w:ilvl w:val="1"/>
+          <w:numId w:val="2"/>
+        </w:numPr>
+      </w:pPr>
+      <w:proofErr w:type="spellStart"/>
+      <w:r>
+        <w:t>Stage</w:t>
+      </w:r>
+      <w:proofErr w:type="spellEnd"/>
+      <w:r>
+        <w:t xml:space="preserve"> I</w:t>
+      </w:r>
+    </w:p>
+    <w:p>
+      <w:pPr>
+        <w:numPr>
+          <w:ilvl w:val="1"/>
+          <w:numId w:val="2"/>
+        </w:numPr>
+      </w:pPr>
+      <w:proofErr w:type="spellStart"/>
+      <w:r>
+        <w:t>Stage</w:t>
+      </w:r>
+      <w:proofErr w:type="spellEnd"/>
+      <w:r>
+        <w:t xml:space="preserve"> II</w:t>
+      </w:r>
+    </w:p>
+    <w:p>
+      <w:pPr>
+        <w:numPr>
+          <w:ilvl w:val="1"/>
+          <w:numId w:val="2"/>
+        </w:numPr>
+      </w:pPr>
+      <w:proofErr w:type="spellStart"/>
+      <w:r>
+        <w:t>Stage</w:t>
+      </w:r>
+      <w:proofErr w:type="spellEnd"/>
+      <w:r>
+        <w:t xml:space="preserve"> III</w:t>
+      </w:r>
+    </w:p>
+    <w:p>
+      <w:pPr>
+        <w:numPr>
+          <w:ilvl w:val="1"/>
+          <w:numId w:val="2"/>
+        </w:numPr>
+      </w:pPr>
+      <w:proofErr w:type="spellStart"/>
+      <w:r>
+        <w:t>Stage</w:t>
+      </w:r>
+      <w:proofErr w:type="spellEnd"/>
+      <w:r>
+        <w:t xml:space="preserve"> IV</w:t>
+      </w:r>
+    </w:p>
+    <w:p>
+      <w:pPr>
+        <w:numPr>
+          <w:ilvl w:val="0"/>
+          <w:numId w:val="2"/>
+        </w:numPr>
+      </w:pPr>
+      <w:proofErr w:type="spellStart"/>
+      <w:r>
+        <w:rPr>
+          <w:b/>
+          <w:bCs/>
+        </w:rPr>
+        <w:t>pressure_ulcers_location</w:t>
+      </w:r>
+      <w:proofErr w:type="spellEnd"/>
+      <w:r>
+        <w:t xml:space="preserve">: </w:t>
+      </w:r>
+      <w:proofErr w:type="spellStart"/>
+      <w:r>
+        <w:t>String</w:t>
+      </w:r>
+      <w:proofErr w:type="spellEnd"/>
+      <w:r>
+        <w:br/>
+      </w:r>
+      <w:r>
+        <w:rPr>
+          <w:i/>
+          <w:iCs/>
+        </w:rPr>
+        <w:t>Ubicación de las úlceras por presión.</w:t>
+      </w:r>
+    </w:p>
+    <w:p>
+      <w:pPr>
+        <w:numPr>
+          <w:ilvl w:val="0"/>
+          <w:numId w:val="2"/>
+        </w:numPr>
+      </w:pPr>
+      <w:proofErr w:type="spellStart"/>
+      <w:r>
+        <w:rPr>
+          <w:b/>
+          <w:bCs/>
+        </w:rPr>
+        <w:t>skin_lesions</w:t>
+      </w:r>
+      <w:proofErr w:type="spellEnd"/>
+      <w:r>
+        <w:t xml:space="preserve">: </w:t>
+      </w:r>
+      <w:proofErr w:type="spellStart"/>
+      <w:r>
+        <w:t>String</w:t>
+      </w:r>
+      <w:proofErr w:type="spellEnd"/>
+      <w:r>
+        <w:br/>
+      </w:r>
+      <w:r>
+        <w:rPr>
+          <w:i/>
+          <w:iCs/>
+        </w:rPr>
+        <w:t>Otras lesiones en la piel.</w:t>
+      </w:r>
+    </w:p>
+    <w:p>
+      <w:pPr>
+        <w:numPr>
+          <w:ilvl w:val="0"/>
+          <w:numId w:val="2"/>
+        </w:numPr>
+      </w:pPr>
+      <w:r>
+        <w:rPr>
+          <w:b/>
+          <w:bCs/>
+        </w:rPr>
+        <w:t>edema</w:t>
+      </w:r>
+      <w:r>
+        <w:t xml:space="preserve">: </w:t>
+      </w:r>
+      <w:proofErr w:type="spellStart"/>
+      <w:r>
+        <w:t>Boolean</w:t>
+      </w:r>
+      <w:proofErr w:type="spellEnd"/>
+      <w:r>
+        <w:br/>
+      </w:r>
+      <w:r>
+        <w:rPr>
+          <w:i/>
+          <w:iCs/>
+        </w:rPr>
+        <w:t>¿Presencia de edemas?</w:t>
+      </w:r>
+    </w:p>
+    <w:p>
+      <w:pPr>
+        <w:numPr>
+          <w:ilvl w:val="0"/>
+          <w:numId w:val="2"/>
+        </w:numPr>
+      </w:pPr>
+      <w:proofErr w:type="spellStart"/>
+      <w:r>
+        <w:rPr>
+          <w:b/>
+          <w:bCs/>
+        </w:rPr>
+        <w:t>edema_location</w:t>
+      </w:r>
+      <w:proofErr w:type="spellEnd"/>
+      <w:r>
+        <w:t xml:space="preserve">: </w:t>
+      </w:r>
+      <w:proofErr w:type="spellStart"/>
+      <w:r>
+        <w:t>String</w:t>
+      </w:r>
+      <w:proofErr w:type="spellEnd"/>
+      <w:r>
+        <w:br/>
+      </w:r>
+      <w:r>
+        <w:rPr>
+          <w:i/>
+          <w:iCs/>
+        </w:rPr>
+        <w:t>Ubicación del edema.</w:t>
+      </w:r>
+    </w:p>
+    <w:p>
+      <w:pPr>
+        <w:numPr>
+          <w:ilvl w:val="0"/>
+          <w:numId w:val="2"/>
+        </w:numPr>
+      </w:pPr>
+      <w:proofErr w:type="spellStart"/>
+      <w:r>
+        <w:rPr>
+          <w:b/>
+          <w:bCs/>
+        </w:rPr>
+        <w:t>ostomies</w:t>
+      </w:r>
+      <w:proofErr w:type="spellEnd"/>
+      <w:r>
+        <w:t xml:space="preserve">: </w:t>
+      </w:r>
+      <w:proofErr w:type="spellStart"/>
+      <w:r>
+        <w:t>Boolean</w:t>
+      </w:r>
+      <w:proofErr w:type="spellEnd"/>
+      <w:r>
+        <w:br/>
+      </w:r>
+      <w:r>
+        <w:rPr>
+          <w:i/>
+          <w:iCs/>
+        </w:rPr>
+        <w:t>¿Tiene ostomías?</w:t>
+      </w:r>
+    </w:p>
+    <w:p>
+      <w:pPr>
+        <w:numPr>
+          <w:ilvl w:val="0"/>
+          <w:numId w:val="2"/>
+        </w:numPr>
+      </w:pPr>
+      <w:proofErr w:type="spellStart"/>
+      <w:r>
+        <w:rPr>
+          <w:b/>
+          <w:bCs/>
+        </w:rPr>
+        <w:t>ostomy_type</w:t>
+      </w:r>
+      <w:proofErr w:type="spellEnd"/>
+      <w:r>
+        <w:t xml:space="preserve">: </w:t>
+      </w:r>
+      <w:proofErr w:type="spellStart"/>
+      <w:r>
+        <w:t>String</w:t>
+      </w:r>
+      <w:proofErr w:type="spellEnd"/>
+      <w:r>
+        <w:br/>
+      </w:r>
+      <w:r>
+        <w:rPr>
+          <w:i/>
+          <w:iCs/>
+        </w:rPr>
+        <w:t>Tipo de ostomía, si aplica.</w:t>
+      </w:r>
+    </w:p>
+    <w:p>
+      <w:pPr>
+        <w:numPr>
+          <w:ilvl w:val="0"/>
+          <w:numId w:val="2"/>
+        </w:numPr>
+      </w:pPr>
+      <w:proofErr w:type="spellStart"/>
+      <w:r>
+        <w:rPr>
+          <w:b/>
+          <w:bCs/>
+        </w:rPr>
+        <w:t>other_disorders</w:t>
+      </w:r>
+      <w:proofErr w:type="spellEnd"/>
+      <w:r>
+        <w:t xml:space="preserve">: </w:t>
+      </w:r>
+      <w:proofErr w:type="spellStart"/>
+      <w:r>
+        <w:t>String</w:t>
+      </w:r>
+      <w:proofErr w:type="spellEnd"/>
+      <w:r>
+        <w:br/>
+      </w:r>
+      <w:r>
+        <w:rPr>
+          <w:i/>
+          <w:iCs/>
+        </w:rPr>
+        <w:t>Otros trastornos (fístulas, etc.).</w:t>
+      </w:r>
+    </w:p>
+    <w:p>
+      <w:pPr>
+        <w:numPr>
+          <w:ilvl w:val="0"/>
+          <w:numId w:val="2"/>
+        </w:numPr>
+      </w:pPr>
+      <w:proofErr w:type="spellStart"/>
+      <w:r>
+        <w:rPr>
+          <w:b/>
+          <w:bCs/>
+        </w:rPr>
+        <w:t>care_plan</w:t>
+      </w:r>
+      <w:proofErr w:type="spellEnd"/>
+      <w:r>
+        <w:t xml:space="preserve">: Array </w:t>
+      </w:r>
+      <w:proofErr w:type="spellStart"/>
+      <w:r>
+        <w:t>of</w:t>
+      </w:r>
+      <w:proofErr w:type="spellEnd"/>
+      <w:r>
+        <w:t xml:space="preserve"> </w:t>
+      </w:r>
+      <w:proofErr w:type="spellStart"/>
+      <w:r>
+        <w:t>Strings</w:t>
+      </w:r>
+      <w:proofErr w:type="spellEnd"/>
+      <w:r>
+        <w:br/>
+      </w:r>
+      <w:r>
+        <w:rPr>
+          <w:i/>
+          <w:iCs/>
+        </w:rPr>
+        <w:t>Plan de cuidados, descripciones detalladas.</w:t>
       </w:r>
     </w:p>
     <w:p/>
@@ -2508,11 +4526,11 @@
 <file path=word/numbering.xml><?xml version="1.0" encoding="utf-8"?>
 <w:numbering xmlns:wpc="http://schemas.microsoft.com/office/word/2010/wordprocessingCanvas" xmlns:cx="http://schemas.microsoft.com/office/drawing/2014/chartex" xmlns:cx1="http://schemas.microsoft.com/office/drawing/2015/9/8/chartex" xmlns:cx2="http://schemas.microsoft.com/office/drawing/2015/10/21/chartex" xmlns:cx3="http://schemas.microsoft.com/office/drawing/2016/5/9/chartex" xmlns:cx4="http://schemas.microsoft.com/office/drawing/2016/5/10/chartex" xmlns:cx5="http://schemas.microsoft.com/office/drawing/2016/5/11/chartex" xmlns:cx6="http://schemas.microsoft.com/office/drawing/2016/5/12/chartex" xmlns:cx7="http://schemas.microsoft.com/office/drawing/2016/5/13/chartex" xmlns:cx8="http://schemas.microsoft.com/office/drawing/2016/5/14/chartex" xmlns:mc="http://schemas.openxmlformats.org/markup-compatibility/2006" xmlns:aink="http://schemas.microsoft.com/office/drawing/2016/ink" xmlns:am3d="http://schemas.microsoft.com/office/drawing/2017/model3d" xmlns:o="urn:schemas-microsoft-com:office:office" xmlns:oel="http://schemas.microsoft.com/office/2019/extlst" xmlns:r="http://schemas.openxmlformats.org/officeDocument/2006/relationships" xmlns:m="http://schemas.openxmlformats.org/officeDocument/2006/math" xmlns:v="urn:schemas-microsoft-com:vml" xmlns:wp14="http://schemas.microsoft.com/office/word/2010/wordprocessingDrawing" xmlns:wp="http://schemas.openxmlformats.org/drawingml/2006/wordprocessingDrawing" xmlns:w10="urn:schemas-microsoft-com:office:word" xmlns:w="http://schemas.openxmlformats.org/wordprocessingml/2006/main" xmlns:w14="http://schemas.microsoft.com/office/word/2010/wordml" xmlns:w15="http://schemas.microsoft.com/office/word/2012/wordml" xmlns:w16cex="http://schemas.microsoft.com/office/word/2018/wordml/cex" xmlns:w16cid="http://schemas.microsoft.com/office/word/2016/wordml/cid" xmlns:w16="http://schemas.microsoft.com/office/word/2018/wordml" xmlns:w16du="http://schemas.microsoft.com/office/word/2023/wordml/word16du" xmlns:w16sdtdh="http://schemas.microsoft.com/office/word/2020/wordml/sdtdatahash" xmlns:w16se="http://schemas.microsoft.com/office/word/2015/wordml/symex" xmlns:wpg="http://schemas.microsoft.com/office/word/2010/wordprocessingGroup" xmlns:wpi="http://schemas.microsoft.com/office/word/2010/wordprocessingInk" xmlns:wne="http://schemas.microsoft.com/office/word/2006/wordml" xmlns:wps="http://schemas.microsoft.com/office/word/2010/wordprocessingShape" mc:Ignorable="w14 w15 w16se w16cid w16 w16cex w16sdtdh w16du wp14">
   <w:abstractNum w:abstractNumId="0" w15:restartNumberingAfterBreak="0">
-    <w:nsid w:val="35831306"/>
+    <w:nsid w:val="0B8E09CF"/>
     <w:multiLevelType w:val="multilevel"/>
-    <w:tmpl w:val="E9CA8F50"/>
+    <w:tmpl w:val="E73A41DA"/>
     <w:lvl w:ilvl="0">
-      <w:start w:val="1"/>
+      <w:start w:val="38"/>
       <w:numFmt w:val="decimal"/>
       <w:lvlText w:val="%1."/>
       <w:lvlJc w:val="left"/>
@@ -2624,7 +4642,127 @@
       </w:pPr>
     </w:lvl>
   </w:abstractNum>
+  <w:abstractNum w:abstractNumId="1" w15:restartNumberingAfterBreak="0">
+    <w:nsid w:val="35831306"/>
+    <w:multiLevelType w:val="multilevel"/>
+    <w:tmpl w:val="E9CA8F50"/>
+    <w:lvl w:ilvl="0">
+      <w:start w:val="1"/>
+      <w:numFmt w:val="decimal"/>
+      <w:lvlText w:val="%1."/>
+      <w:lvlJc w:val="left"/>
+      <w:pPr>
+        <w:tabs>
+          <w:tab w:val="num" w:pos="720"/>
+        </w:tabs>
+        <w:ind w:left="720" w:hanging="360"/>
+      </w:pPr>
+    </w:lvl>
+    <w:lvl w:ilvl="1">
+      <w:start w:val="1"/>
+      <w:numFmt w:val="bullet"/>
+      <w:lvlText w:val="o"/>
+      <w:lvlJc w:val="left"/>
+      <w:pPr>
+        <w:tabs>
+          <w:tab w:val="num" w:pos="1440"/>
+        </w:tabs>
+        <w:ind w:left="1440" w:hanging="360"/>
+      </w:pPr>
+      <w:rPr>
+        <w:rFonts w:ascii="Courier New" w:hAnsi="Courier New" w:hint="default"/>
+        <w:sz w:val="20"/>
+      </w:rPr>
+    </w:lvl>
+    <w:lvl w:ilvl="2" w:tentative="1">
+      <w:start w:val="1"/>
+      <w:numFmt w:val="decimal"/>
+      <w:lvlText w:val="%3."/>
+      <w:lvlJc w:val="left"/>
+      <w:pPr>
+        <w:tabs>
+          <w:tab w:val="num" w:pos="2160"/>
+        </w:tabs>
+        <w:ind w:left="2160" w:hanging="360"/>
+      </w:pPr>
+    </w:lvl>
+    <w:lvl w:ilvl="3" w:tentative="1">
+      <w:start w:val="1"/>
+      <w:numFmt w:val="decimal"/>
+      <w:lvlText w:val="%4."/>
+      <w:lvlJc w:val="left"/>
+      <w:pPr>
+        <w:tabs>
+          <w:tab w:val="num" w:pos="2880"/>
+        </w:tabs>
+        <w:ind w:left="2880" w:hanging="360"/>
+      </w:pPr>
+    </w:lvl>
+    <w:lvl w:ilvl="4" w:tentative="1">
+      <w:start w:val="1"/>
+      <w:numFmt w:val="decimal"/>
+      <w:lvlText w:val="%5."/>
+      <w:lvlJc w:val="left"/>
+      <w:pPr>
+        <w:tabs>
+          <w:tab w:val="num" w:pos="3600"/>
+        </w:tabs>
+        <w:ind w:left="3600" w:hanging="360"/>
+      </w:pPr>
+    </w:lvl>
+    <w:lvl w:ilvl="5" w:tentative="1">
+      <w:start w:val="1"/>
+      <w:numFmt w:val="decimal"/>
+      <w:lvlText w:val="%6."/>
+      <w:lvlJc w:val="left"/>
+      <w:pPr>
+        <w:tabs>
+          <w:tab w:val="num" w:pos="4320"/>
+        </w:tabs>
+        <w:ind w:left="4320" w:hanging="360"/>
+      </w:pPr>
+    </w:lvl>
+    <w:lvl w:ilvl="6" w:tentative="1">
+      <w:start w:val="1"/>
+      <w:numFmt w:val="decimal"/>
+      <w:lvlText w:val="%7."/>
+      <w:lvlJc w:val="left"/>
+      <w:pPr>
+        <w:tabs>
+          <w:tab w:val="num" w:pos="5040"/>
+        </w:tabs>
+        <w:ind w:left="5040" w:hanging="360"/>
+      </w:pPr>
+    </w:lvl>
+    <w:lvl w:ilvl="7" w:tentative="1">
+      <w:start w:val="1"/>
+      <w:numFmt w:val="decimal"/>
+      <w:lvlText w:val="%8."/>
+      <w:lvlJc w:val="left"/>
+      <w:pPr>
+        <w:tabs>
+          <w:tab w:val="num" w:pos="5760"/>
+        </w:tabs>
+        <w:ind w:left="5760" w:hanging="360"/>
+      </w:pPr>
+    </w:lvl>
+    <w:lvl w:ilvl="8" w:tentative="1">
+      <w:start w:val="1"/>
+      <w:numFmt w:val="decimal"/>
+      <w:lvlText w:val="%9."/>
+      <w:lvlJc w:val="left"/>
+      <w:pPr>
+        <w:tabs>
+          <w:tab w:val="num" w:pos="6480"/>
+        </w:tabs>
+        <w:ind w:left="6480" w:hanging="360"/>
+      </w:pPr>
+    </w:lvl>
+  </w:abstractNum>
   <w:num w:numId="1" w16cid:durableId="685597792">
+    <w:abstractNumId w:val="1"/>
+  </w:num>
+  <w:num w:numId="2" w16cid:durableId="1294795388">
     <w:abstractNumId w:val="0"/>
   </w:num>
 </w:numbering>

</xml_diff>